<commit_message>
Remove the old EC1 (three-quarters, rounding up).
</commit_message>
<xml_diff>
--- a/Lab 2 - String Operations.docx
+++ b/Lab 2 - String Operations.docx
@@ -1438,6 +1438,7 @@
           <w:rFonts w:ascii="TimesNewRomanPSMT" w:hAnsi="TimesNewRomanPSMT"/>
           <w:szCs w:val="32"/>
         </w:rPr>
+        <w:lastRenderedPageBreak/>
         <w:t xml:space="preserve">In all cases, you </w:t>
       </w:r>
       <w:r>
@@ -2598,6 +2599,7 @@
           <w:bCs/>
           <w:szCs w:val="26"/>
         </w:rPr>
+        <w:lastRenderedPageBreak/>
         <w:t>Part 4:</w:t>
       </w:r>
     </w:p>
@@ -3631,7 +3633,15 @@
           <w:rFonts w:ascii="Helvetica" w:hAnsi="Helvetica"/>
           <w:szCs w:val="26"/>
         </w:rPr>
-        <w:t xml:space="preserve">fish have green </w:t>
+        <w:t xml:space="preserve">fish have </w:t>
+      </w:r>
+      <w:r>
+        <w:rPr>
+          <w:rFonts w:ascii="Helvetica" w:hAnsi="Helvetica"/>
+          <w:szCs w:val="26"/>
+        </w:rPr>
+        <w:lastRenderedPageBreak/>
+        <w:t xml:space="preserve">green </w:t>
       </w:r>
       <w:proofErr w:type="spellStart"/>
       <w:r>
@@ -4468,386 +4478,6 @@
         </w:rPr>
         <w:t>Extra Credit</w:t>
       </w:r>
-    </w:p>
-    <w:p>
-      <w:pPr>
-        <w:keepNext/>
-        <w:keepLines/>
-        <w:widowControl w:val="0"/>
-        <w:autoSpaceDE w:val="0"/>
-        <w:autoSpaceDN w:val="0"/>
-        <w:adjustRightInd w:val="0"/>
-        <w:rPr>
-          <w:szCs w:val="26"/>
-        </w:rPr>
-      </w:pPr>
-      <w:r>
-        <w:rPr>
-          <w:szCs w:val="26"/>
-        </w:rPr>
-        <w:t xml:space="preserve">The remaining portion of the lab is optional and can be completed </w:t>
-      </w:r>
-      <w:r>
-        <w:rPr>
-          <w:szCs w:val="26"/>
-        </w:rPr>
-        <w:t xml:space="preserve">in any order </w:t>
-      </w:r>
-      <w:r>
-        <w:rPr>
-          <w:szCs w:val="26"/>
-        </w:rPr>
-        <w:t xml:space="preserve">for extra credit. </w:t>
-      </w:r>
-    </w:p>
-    <w:p>
-      <w:pPr>
-        <w:keepNext/>
-        <w:keepLines/>
-        <w:widowControl w:val="0"/>
-        <w:autoSpaceDE w:val="0"/>
-        <w:autoSpaceDN w:val="0"/>
-        <w:adjustRightInd w:val="0"/>
-        <w:rPr>
-          <w:szCs w:val="26"/>
-        </w:rPr>
-      </w:pPr>
-    </w:p>
-    <w:p>
-      <w:pPr>
-        <w:widowControl w:val="0"/>
-        <w:autoSpaceDE w:val="0"/>
-        <w:autoSpaceDN w:val="0"/>
-        <w:adjustRightInd w:val="0"/>
-        <w:rPr>
-          <w:rFonts w:ascii="TimesNewRomanPSMT" w:hAnsi="TimesNewRomanPSMT"/>
-          <w:szCs w:val="32"/>
-        </w:rPr>
-      </w:pPr>
-      <w:proofErr w:type="spellStart"/>
-      <w:r>
-        <w:rPr>
-          <w:rFonts w:ascii="Courier New" w:hAnsi="Courier New" w:cs="Courier New"/>
-          <w:sz w:val="22"/>
-          <w:szCs w:val="26"/>
-        </w:rPr>
-        <w:t>stringFirstThreeQuarters</w:t>
-      </w:r>
-      <w:proofErr w:type="spellEnd"/>
-      <w:r>
-        <w:rPr>
-          <w:rFonts w:ascii="TimesNewRomanPSMT" w:hAnsi="TimesNewRomanPSMT"/>
-          <w:szCs w:val="32"/>
-        </w:rPr>
-        <w:t xml:space="preserve">: Produce a (trimmed) string that contains only the first 75% of the characters </w:t>
-      </w:r>
-      <w:r>
-        <w:rPr>
-          <w:rFonts w:ascii="TimesNewRomanPSMT" w:hAnsi="TimesNewRomanPSMT"/>
-          <w:szCs w:val="32"/>
-        </w:rPr>
-        <w:t>that</w:t>
-      </w:r>
-      <w:r>
-        <w:rPr>
-          <w:rFonts w:ascii="TimesNewRomanPSMT" w:hAnsi="TimesNewRomanPSMT"/>
-          <w:szCs w:val="32"/>
-        </w:rPr>
-        <w:t xml:space="preserve"> are in the input. If the number of characters is not an exact multiple of 4, "round up" to the whole number that is above 75%, but is as close as possible. </w:t>
-      </w:r>
-    </w:p>
-    <w:p>
-      <w:pPr>
-        <w:widowControl w:val="0"/>
-        <w:autoSpaceDE w:val="0"/>
-        <w:autoSpaceDN w:val="0"/>
-        <w:adjustRightInd w:val="0"/>
-        <w:rPr>
-          <w:rFonts w:ascii="TimesNewRomanPSMT" w:hAnsi="TimesNewRomanPSMT"/>
-          <w:szCs w:val="32"/>
-        </w:rPr>
-      </w:pPr>
-    </w:p>
-    <w:p>
-      <w:pPr>
-        <w:widowControl w:val="0"/>
-        <w:autoSpaceDE w:val="0"/>
-        <w:autoSpaceDN w:val="0"/>
-        <w:adjustRightInd w:val="0"/>
-        <w:rPr>
-          <w:rFonts w:ascii="TimesNewRomanPSMT" w:hAnsi="TimesNewRomanPSMT"/>
-          <w:szCs w:val="32"/>
-        </w:rPr>
-      </w:pPr>
-      <w:r>
-        <w:rPr>
-          <w:rFonts w:ascii="TimesNewRomanPSMT" w:hAnsi="TimesNewRomanPSMT"/>
-          <w:szCs w:val="32"/>
-        </w:rPr>
-        <w:t xml:space="preserve">For example, if the input is the 12-character string </w:t>
-      </w:r>
-      <w:r>
-        <w:rPr>
-          <w:rFonts w:ascii="Helvetica" w:hAnsi="Helvetica"/>
-          <w:szCs w:val="26"/>
-        </w:rPr>
-        <w:t>Jacob Marley</w:t>
-      </w:r>
-      <w:r>
-        <w:rPr>
-          <w:rFonts w:ascii="TimesNewRomanPSMT" w:hAnsi="TimesNewRomanPSMT"/>
-          <w:szCs w:val="32"/>
-        </w:rPr>
-        <w:t xml:space="preserve">, then the </w:t>
-      </w:r>
-      <w:r>
-        <w:rPr>
-          <w:rFonts w:ascii="TimesNewRomanPSMT" w:hAnsi="TimesNewRomanPSMT"/>
-          <w:szCs w:val="32"/>
-        </w:rPr>
-        <w:t>return value</w:t>
-      </w:r>
-      <w:r>
-        <w:rPr>
-          <w:rFonts w:ascii="TimesNewRomanPSMT" w:hAnsi="TimesNewRomanPSMT"/>
-          <w:szCs w:val="32"/>
-        </w:rPr>
-        <w:t xml:space="preserve"> should be the 9-character string </w:t>
-      </w:r>
-      <w:r>
-        <w:rPr>
-          <w:rFonts w:ascii="Helvetica" w:hAnsi="Helvetica"/>
-          <w:szCs w:val="26"/>
-        </w:rPr>
-        <w:t>Jacob Mar</w:t>
-      </w:r>
-      <w:r>
-        <w:rPr>
-          <w:rFonts w:ascii="TimesNewRomanPSMT" w:hAnsi="TimesNewRomanPSMT"/>
-          <w:szCs w:val="32"/>
-        </w:rPr>
-        <w:t xml:space="preserve">. If the input is the 10-character string </w:t>
-      </w:r>
-      <w:r>
-        <w:rPr>
-          <w:rFonts w:ascii="Helvetica" w:hAnsi="Helvetica"/>
-          <w:szCs w:val="26"/>
-        </w:rPr>
-        <w:t>Jackhammer</w:t>
-      </w:r>
-      <w:r>
-        <w:rPr>
-          <w:rFonts w:ascii="TimesNewRomanPSMT" w:hAnsi="TimesNewRomanPSMT"/>
-          <w:szCs w:val="32"/>
-        </w:rPr>
-        <w:t xml:space="preserve">, then the </w:t>
-      </w:r>
-      <w:r>
-        <w:rPr>
-          <w:rFonts w:ascii="TimesNewRomanPSMT" w:hAnsi="TimesNewRomanPSMT"/>
-          <w:szCs w:val="32"/>
-        </w:rPr>
-        <w:t>return value</w:t>
-      </w:r>
-      <w:r>
-        <w:rPr>
-          <w:rFonts w:ascii="TimesNewRomanPSMT" w:hAnsi="TimesNewRomanPSMT"/>
-          <w:szCs w:val="32"/>
-        </w:rPr>
-        <w:t xml:space="preserve"> should be the 8-character string </w:t>
-      </w:r>
-      <w:proofErr w:type="spellStart"/>
-      <w:r>
-        <w:rPr>
-          <w:rFonts w:ascii="Helvetica" w:hAnsi="Helvetica"/>
-          <w:szCs w:val="26"/>
-        </w:rPr>
-        <w:t>Jackhamm</w:t>
-      </w:r>
-      <w:proofErr w:type="spellEnd"/>
-      <w:r>
-        <w:rPr>
-          <w:rFonts w:ascii="TimesNewRomanPSMT" w:hAnsi="TimesNewRomanPSMT"/>
-          <w:szCs w:val="32"/>
-        </w:rPr>
-        <w:t>.</w:t>
-      </w:r>
-      <w:r>
-        <w:rPr>
-          <w:rFonts w:ascii="TimesNewRomanPSMT" w:hAnsi="TimesNewRomanPSMT"/>
-          <w:szCs w:val="32"/>
-        </w:rPr>
-        <w:t xml:space="preserve"> </w:t>
-      </w:r>
-    </w:p>
-    <w:p>
-      <w:pPr>
-        <w:widowControl w:val="0"/>
-        <w:autoSpaceDE w:val="0"/>
-        <w:autoSpaceDN w:val="0"/>
-        <w:adjustRightInd w:val="0"/>
-        <w:rPr>
-          <w:rFonts w:ascii="TimesNewRomanPSMT" w:hAnsi="TimesNewRomanPSMT"/>
-          <w:szCs w:val="32"/>
-        </w:rPr>
-      </w:pPr>
-    </w:p>
-    <w:p>
-      <w:pPr>
-        <w:widowControl w:val="0"/>
-        <w:autoSpaceDE w:val="0"/>
-        <w:autoSpaceDN w:val="0"/>
-        <w:adjustRightInd w:val="0"/>
-        <w:rPr>
-          <w:rFonts w:ascii="TimesNewRomanPSMT" w:hAnsi="TimesNewRomanPSMT"/>
-          <w:szCs w:val="32"/>
-        </w:rPr>
-      </w:pPr>
-      <w:r>
-        <w:rPr>
-          <w:rFonts w:ascii="TimesNewRomanPSMT" w:hAnsi="TimesNewRomanPSMT"/>
-          <w:szCs w:val="32"/>
-        </w:rPr>
-        <w:t xml:space="preserve">Complete this task without using an </w:t>
-      </w:r>
-      <w:r>
-        <w:rPr>
-          <w:rFonts w:ascii="Courier New" w:hAnsi="Courier New" w:cs="Courier New"/>
-          <w:szCs w:val="32"/>
-        </w:rPr>
-        <w:t>if</w:t>
-      </w:r>
-      <w:r>
-        <w:rPr>
-          <w:rFonts w:ascii="TimesNewRomanPSMT" w:hAnsi="TimesNewRomanPSMT"/>
-          <w:szCs w:val="32"/>
-        </w:rPr>
-        <w:t xml:space="preserve"> statement. </w:t>
-      </w:r>
-    </w:p>
-    <w:p>
-      <w:pPr>
-        <w:widowControl w:val="0"/>
-        <w:autoSpaceDE w:val="0"/>
-        <w:autoSpaceDN w:val="0"/>
-        <w:adjustRightInd w:val="0"/>
-        <w:rPr>
-          <w:rFonts w:ascii="Times-Bold" w:hAnsi="Times-Bold"/>
-          <w:b/>
-          <w:szCs w:val="32"/>
-          <w:u w:val="single"/>
-        </w:rPr>
-      </w:pPr>
-    </w:p>
-    <w:p>
-      <w:pPr>
-        <w:widowControl w:val="0"/>
-        <w:autoSpaceDE w:val="0"/>
-        <w:autoSpaceDN w:val="0"/>
-        <w:adjustRightInd w:val="0"/>
-        <w:rPr>
-          <w:rFonts w:ascii="Times-Bold" w:hAnsi="Times-Bold"/>
-          <w:b/>
-          <w:szCs w:val="32"/>
-        </w:rPr>
-      </w:pPr>
-      <w:r>
-        <w:rPr>
-          <w:rFonts w:ascii="Times-Bold" w:hAnsi="Times-Bold"/>
-          <w:b/>
-          <w:szCs w:val="32"/>
-          <w:u w:val="single"/>
-        </w:rPr>
-        <w:t xml:space="preserve">checkpoint </w:t>
-      </w:r>
-      <w:r>
-        <w:rPr>
-          <w:rFonts w:ascii="Times-Bold" w:hAnsi="Times-Bold"/>
-          <w:b/>
-          <w:szCs w:val="32"/>
-          <w:u w:val="single"/>
-        </w:rPr>
-        <w:t>EC1</w:t>
-      </w:r>
-      <w:r>
-        <w:rPr>
-          <w:rFonts w:ascii="Times-Bold" w:hAnsi="Times-Bold"/>
-          <w:b/>
-          <w:szCs w:val="32"/>
-          <w:u w:val="single"/>
-        </w:rPr>
-        <w:t xml:space="preserve"> (</w:t>
-      </w:r>
-      <w:r>
-        <w:rPr>
-          <w:rFonts w:ascii="Times-Bold" w:hAnsi="Times-Bold"/>
-          <w:b/>
-          <w:szCs w:val="32"/>
-          <w:u w:val="single"/>
-        </w:rPr>
-        <w:t>5</w:t>
-      </w:r>
-      <w:r>
-        <w:rPr>
-          <w:rFonts w:ascii="Times-Bold" w:hAnsi="Times-Bold"/>
-          <w:b/>
-          <w:szCs w:val="32"/>
-          <w:u w:val="single"/>
-        </w:rPr>
-        <w:t xml:space="preserve"> points):</w:t>
-      </w:r>
-      <w:r>
-        <w:rPr>
-          <w:rFonts w:ascii="Times-Bold" w:hAnsi="Times-Bold"/>
-          <w:b/>
-          <w:szCs w:val="32"/>
-        </w:rPr>
-        <w:t xml:space="preserve"> Have your lab instructor or assistant confirm that your </w:t>
-      </w:r>
-      <w:proofErr w:type="spellStart"/>
-      <w:r>
-        <w:rPr>
-          <w:rFonts w:ascii="Helvetica-Bold" w:hAnsi="Helvetica-Bold"/>
-          <w:b/>
-          <w:szCs w:val="26"/>
-        </w:rPr>
-        <w:t>stringFirstThreeQuarters</w:t>
-      </w:r>
-      <w:proofErr w:type="spellEnd"/>
-      <w:r>
-        <w:rPr>
-          <w:rFonts w:ascii="Times-Bold" w:hAnsi="Times-Bold"/>
-          <w:b/>
-          <w:szCs w:val="32"/>
-        </w:rPr>
-        <w:t xml:space="preserve"> is working properly.</w:t>
-      </w:r>
-    </w:p>
-    <w:p>
-      <w:pPr>
-        <w:widowControl w:val="0"/>
-        <w:autoSpaceDE w:val="0"/>
-        <w:autoSpaceDN w:val="0"/>
-        <w:adjustRightInd w:val="0"/>
-        <w:rPr>
-          <w:rFonts w:ascii="Times-Bold" w:hAnsi="Times-Bold"/>
-          <w:b/>
-          <w:szCs w:val="32"/>
-        </w:rPr>
-      </w:pPr>
-    </w:p>
-    <w:p>
-      <w:pPr>
-        <w:keepNext/>
-        <w:keepLines/>
-        <w:widowControl w:val="0"/>
-        <w:autoSpaceDE w:val="0"/>
-        <w:autoSpaceDN w:val="0"/>
-        <w:adjustRightInd w:val="0"/>
-        <w:rPr>
-          <w:szCs w:val="26"/>
-        </w:rPr>
-      </w:pPr>
     </w:p>
     <w:p>
       <w:pPr>
@@ -5030,6 +4660,7 @@
         <w:rPr>
           <w:sz w:val="22"/>
         </w:rPr>
+        <w:lastRenderedPageBreak/>
         <w:t xml:space="preserve">For </w:t>
       </w:r>
       <w:proofErr w:type="spellStart"/>
@@ -5340,7 +4971,16 @@
           <w:szCs w:val="32"/>
           <w:u w:val="single"/>
         </w:rPr>
-        <w:t xml:space="preserve"> EC2</w:t>
+        <w:t xml:space="preserve"> EC</w:t>
+      </w:r>
+      <w:r>
+        <w:rPr>
+          <w:rFonts w:ascii="Times-Bold" w:hAnsi="Times-Bold"/>
+          <w:b/>
+          <w:szCs w:val="32"/>
+          <w:u w:val="single"/>
+        </w:rPr>
+        <w:t>1</w:t>
       </w:r>
       <w:r>
         <w:rPr>

</xml_diff>